<commit_message>
Dejar lista para firmar la declaración de la Dra. Adriana Álvarez
Fecha en blanco para que la ponga al firmar (llevaba el 29/09) y
casilla de la declaración más estrecha. Se añade la versión en PDF.

Co-Authored-By: Claude Opus 5.5 <noreply@anthropic.com>
Claude-Session: https://claude.ai/code/session_012B5UyXLL9ubxzuQGBWyzbg
</commit_message>
<xml_diff>
--- a/curso-obesidad-seda/SEDA_COI_Adriana_Alvarez_prellenada.docx
+++ b/curso-obesidad-seda/SEDA_COI_Adriana_Alvarez_prellenada.docx
@@ -414,15 +414,18 @@
         <w:tblLook w:firstColumn="1" w:firstRow="1" w:lastColumn="0" w:lastRow="0" w:noHBand="0" w:noVBand="1" w:val="04A0"/>
       </w:tblPr>
       <w:tblGrid>
-        <w:gridCol w:w="4873"/>
-        <w:gridCol w:w="4873"/>
+        <w:gridCol w:w="794"/>
+        <w:gridCol w:w="8844"/>
       </w:tblGrid>
       <w:tr>
         <w:tc>
           <w:tcPr>
-            <w:tcW w:type="dxa" w:w="624"/>
+            <w:tcW w:type="dxa" w:w="794"/>
           </w:tcPr>
           <w:p>
+            <w:pPr>
+              <w:jc w:val="center"/>
+            </w:pPr>
             <w:r>
               <w:t>X</w:t>
             </w:r>
@@ -430,7 +433,7 @@
         </w:tc>
         <w:tc>
           <w:tcPr>
-            <w:tcW w:type="dxa" w:w="4873"/>
+            <w:tcW w:type="dxa" w:w="8844"/>
           </w:tcPr>
           <w:p>
             <w:r>
@@ -445,9 +448,12 @@
       <w:tr>
         <w:tc>
           <w:tcPr>
-            <w:tcW w:type="dxa" w:w="624"/>
+            <w:tcW w:type="dxa" w:w="794"/>
           </w:tcPr>
           <w:p>
+            <w:pPr>
+              <w:jc w:val="center"/>
+            </w:pPr>
             <w:r>
               <w:t xml:space="preserve">  </w:t>
             </w:r>
@@ -455,7 +461,7 @@
         </w:tc>
         <w:tc>
           <w:tcPr>
-            <w:tcW w:type="dxa" w:w="4873"/>
+            <w:tcW w:type="dxa" w:w="8844"/>
           </w:tcPr>
           <w:p>
             <w:r>
@@ -857,7 +863,7 @@
                 <w:color w:val="6B6B6B"/>
                 <w:sz w:val="18"/>
               </w:rPr>
-              <w:t>Buenos Aires, 29 de septiembre de 2026</w:t>
+              <w:t>Buenos Aires, ____ de ______________ de 2026</w:t>
             </w:r>
           </w:p>
         </w:tc>

</xml_diff>